<commit_message>
minor fine tuning done
</commit_message>
<xml_diff>
--- a/_includes/projects/past/asimov/output/asimov.docx
+++ b/_includes/projects/past/asimov/output/asimov.docx
@@ -81,6 +81,21 @@
     </w:p>
     <w:p>
       <w:pPr>
+        <w:pStyle w:val="FirstParagraph"/>
+      </w:pPr>
+    </w:p>
+    <w:p>
+      <w:pPr>
+        <w:pStyle w:val="Heading4"/>
+      </w:pPr>
+      <w:bookmarkStart w:id="21" w:name="chicken-factories-of-india"/>
+      <w:r>
+        <w:t xml:space="preserve">Chicken Factories of India</w:t>
+      </w:r>
+      <w:bookmarkEnd w:id="21"/>
+    </w:p>
+    <w:p>
+      <w:pPr>
         <w:pStyle w:val="Compact"/>
       </w:pPr>
       <w:r>
@@ -96,11 +111,11 @@
       <w:pPr>
         <w:pStyle w:val="Heading4"/>
       </w:pPr>
-      <w:bookmarkStart w:id="21" w:name="failing-is-not-bad.."/>
+      <w:bookmarkStart w:id="22" w:name="failing-is-not-bad.."/>
       <w:r>
         <w:t xml:space="preserve">Failing is not Bad..!</w:t>
       </w:r>
-      <w:bookmarkEnd w:id="21"/>
+      <w:bookmarkEnd w:id="22"/>
     </w:p>
     <w:p>
       <w:pPr>
@@ -119,11 +134,11 @@
       <w:pPr>
         <w:pStyle w:val="Heading4"/>
       </w:pPr>
-      <w:bookmarkStart w:id="22" w:name="why-i-applied-to-the-industry"/>
+      <w:bookmarkStart w:id="23" w:name="why-i-applied-to-the-industry"/>
       <w:r>
         <w:t xml:space="preserve">Why I applied to the Industry ?</w:t>
       </w:r>
-      <w:bookmarkEnd w:id="22"/>
+      <w:bookmarkEnd w:id="23"/>
     </w:p>
     <w:p>
       <w:pPr>
@@ -157,11 +172,11 @@
       <w:pPr>
         <w:pStyle w:val="Heading4"/>
       </w:pPr>
-      <w:bookmarkStart w:id="23" w:name="the-best-place-to-work"/>
+      <w:bookmarkStart w:id="24" w:name="the-best-place-to-work"/>
       <w:r>
         <w:t xml:space="preserve">The Best Place to Work</w:t>
       </w:r>
-      <w:bookmarkEnd w:id="23"/>
+      <w:bookmarkEnd w:id="24"/>
     </w:p>
     <w:p>
       <w:pPr>
@@ -173,7 +188,7 @@
       <w:r>
         <w:t xml:space="preserve"> </w:t>
       </w:r>
-      <w:hyperlink r:id="rId24">
+      <w:hyperlink r:id="rId25">
         <w:r>
           <w:rPr>
             <w:b/>
@@ -191,7 +206,7 @@
       <w:r>
         <w:t xml:space="preserve"> </w:t>
       </w:r>
-      <w:hyperlink r:id="rId25">
+      <w:hyperlink r:id="rId26">
         <w:r>
           <w:rPr>
             <w:b/>
@@ -209,7 +224,7 @@
       <w:r>
         <w:t xml:space="preserve"> </w:t>
       </w:r>
-      <w:hyperlink r:id="rId26">
+      <w:hyperlink r:id="rId27">
         <w:r>
           <w:rPr>
             <w:b/>
@@ -224,7 +239,7 @@
       <w:r>
         <w:t xml:space="preserve"> </w:t>
       </w:r>
-      <w:hyperlink r:id="rId27">
+      <w:hyperlink r:id="rId28">
         <w:r>
           <w:rPr>
             <w:b/>
@@ -246,11 +261,11 @@
       <w:pPr>
         <w:pStyle w:val="Heading4"/>
       </w:pPr>
-      <w:bookmarkStart w:id="28" w:name="why-robotics"/>
+      <w:bookmarkStart w:id="29" w:name="why-robotics"/>
       <w:r>
         <w:t xml:space="preserve">Why Robotics ?</w:t>
       </w:r>
-      <w:bookmarkEnd w:id="28"/>
+      <w:bookmarkEnd w:id="29"/>
     </w:p>
     <w:p>
       <w:pPr>
@@ -302,11 +317,11 @@
       <w:pPr>
         <w:pStyle w:val="Heading2"/>
       </w:pPr>
-      <w:bookmarkStart w:id="29" w:name="projects-at-asimov-robotics"/>
+      <w:bookmarkStart w:id="30" w:name="projects-at-asimov-robotics"/>
       <w:r>
         <w:t xml:space="preserve">Projects at Asimov Robotics</w:t>
       </w:r>
-      <w:bookmarkEnd w:id="29"/>
+      <w:bookmarkEnd w:id="30"/>
     </w:p>
     <w:p>
       <w:pPr>

</xml_diff>

<commit_message>
overall template okay other than contact section
</commit_message>
<xml_diff>
--- a/_includes/projects/past/asimov/output/asimov.docx
+++ b/_includes/projects/past/asimov/output/asimov.docx
@@ -191,7 +191,6 @@
       <w:hyperlink r:id="rId25">
         <w:r>
           <w:rPr>
-            <w:b/>
             <w:rStyle w:val="Hyperlink"/>
           </w:rPr>
           <w:t xml:space="preserve">Gokul Narayanan</w:t>
@@ -209,7 +208,6 @@
       <w:hyperlink r:id="rId26">
         <w:r>
           <w:rPr>
-            <w:b/>
             <w:rStyle w:val="Hyperlink"/>
           </w:rPr>
           <w:t xml:space="preserve">Rajashekaran T</w:t>
@@ -227,7 +225,6 @@
       <w:hyperlink r:id="rId27">
         <w:r>
           <w:rPr>
-            <w:b/>
             <w:rStyle w:val="Hyperlink"/>
           </w:rPr>
           <w:t xml:space="preserve">Jayakrishnan T</w:t>
@@ -242,7 +239,6 @@
       <w:hyperlink r:id="rId28">
         <w:r>
           <w:rPr>
-            <w:b/>
             <w:rStyle w:val="Hyperlink"/>
           </w:rPr>
           <w:t xml:space="preserve">Anto John</w:t>

</xml_diff>

<commit_message>
new cv + about me modified + asimov modified
</commit_message>
<xml_diff>
--- a/_includes/projects/past/asimov/output/asimov.docx
+++ b/_includes/projects/past/asimov/output/asimov.docx
@@ -123,13 +123,121 @@
     </w:p>
     <w:p>
       <w:pPr>
-        <w:pStyle w:val="Heading3"/>
-      </w:pPr>
-      <w:bookmarkStart w:id="21" w:name="content"/>
-      <w:r>
-        <w:t xml:space="preserve">Content</w:t>
+        <w:pStyle w:val="BodyText"/>
+      </w:pPr>
+    </w:p>
+    <w:p>
+      <w:pPr>
+        <w:pStyle w:val="Heading4"/>
+      </w:pPr>
+      <w:bookmarkStart w:id="21" w:name="projects-at-asimov-robotics"/>
+      <w:r>
+        <w:t xml:space="preserve">Projects at Asimov Robotics</w:t>
       </w:r>
       <w:bookmarkEnd w:id="21"/>
+    </w:p>
+    <w:p>
+      <w:pPr>
+        <w:pStyle w:val="FirstParagraph"/>
+      </w:pPr>
+      <w:r>
+        <w:t xml:space="preserve">Th task was to develop a</w:t>
+      </w:r>
+      <w:r>
+        <w:t xml:space="preserve"> </w:t>
+      </w:r>
+      <w:hyperlink r:id="rId22">
+        <w:r>
+          <w:rPr>
+            <w:rStyle w:val="Hyperlink"/>
+          </w:rPr>
+          <w:t xml:space="preserve">service robot</w:t>
+        </w:r>
+      </w:hyperlink>
+      <w:r>
+        <w:t xml:space="preserve">. The hardware was built by using</w:t>
+      </w:r>
+      <w:r>
+        <w:t xml:space="preserve"> </w:t>
+      </w:r>
+      <w:hyperlink r:id="rId23">
+        <w:r>
+          <w:rPr>
+            <w:rStyle w:val="Hyperlink"/>
+          </w:rPr>
+          <w:t xml:space="preserve">Dynamixel servos</w:t>
+        </w:r>
+      </w:hyperlink>
+      <w:r>
+        <w:t xml:space="preserve">,</w:t>
+      </w:r>
+      <w:r>
+        <w:t xml:space="preserve"> </w:t>
+      </w:r>
+      <w:hyperlink r:id="rId24">
+        <w:r>
+          <w:rPr>
+            <w:rStyle w:val="Hyperlink"/>
+          </w:rPr>
+          <w:t xml:space="preserve">Hokuyo laser</w:t>
+        </w:r>
+      </w:hyperlink>
+      <w:r>
+        <w:t xml:space="preserve"> </w:t>
+      </w:r>
+      <w:r>
+        <w:t xml:space="preserve">and</w:t>
+      </w:r>
+      <w:r>
+        <w:t xml:space="preserve"> </w:t>
+      </w:r>
+      <w:hyperlink r:id="rId25">
+        <w:r>
+          <w:rPr>
+            <w:rStyle w:val="Hyperlink"/>
+          </w:rPr>
+          <w:t xml:space="preserve">Intel-NUC</w:t>
+        </w:r>
+      </w:hyperlink>
+      <w:r>
+        <w:t xml:space="preserve">. The software was architectured using ROS</w:t>
+      </w:r>
+      <w:r>
+        <w:t xml:space="preserve"> </w:t>
+      </w:r>
+      <w:hyperlink r:id="rId26">
+        <w:r>
+          <w:rPr>
+            <w:rStyle w:val="Hyperlink"/>
+          </w:rPr>
+          <w:t xml:space="preserve">smach</w:t>
+        </w:r>
+      </w:hyperlink>
+      <w:r>
+        <w:t xml:space="preserve">. Users can interact with robot by the screen at the front and based upon the user query, the robot would do a particular task. The task consist of doing some gesture and navigation. Gestures were perfomed by simple record and playback, while navigation was done using</w:t>
+      </w:r>
+      <w:r>
+        <w:t xml:space="preserve"> </w:t>
+      </w:r>
+      <w:hyperlink r:id="rId27">
+        <w:r>
+          <w:rPr>
+            <w:rStyle w:val="Hyperlink"/>
+          </w:rPr>
+          <w:t xml:space="preserve">amcl</w:t>
+        </w:r>
+      </w:hyperlink>
+      <w:r>
+        <w:t xml:space="preserve"> </w:t>
+      </w:r>
+      <w:r>
+        <w:t xml:space="preserve">package. During my six month stay, the various task I did:</w:t>
+      </w:r>
+    </w:p>
+    <w:p>
+      <w:pPr>
+        <w:pStyle w:val="BodyText"/>
+      </w:pPr>
     </w:p>
     <w:p>
       <w:pPr>
@@ -139,14 +247,75 @@
           <w:ilvl w:val="0"/>
         </w:numPr>
       </w:pPr>
-      <w:hyperlink w:anchor="how-i-went-after-robotics">
-        <w:r>
-          <w:rPr>
-            <w:rStyle w:val="Hyperlink"/>
-          </w:rPr>
-          <w:t xml:space="preserve">How I went after robotics ?</w:t>
-        </w:r>
-      </w:hyperlink>
+      <w:r>
+        <w:t xml:space="preserve">Gravity compensation of cool-arm for assistive mode. (didn’t work well, was</w:t>
+      </w:r>
+      <w:r>
+        <w:t xml:space="preserve"> </w:t>
+      </w:r>
+      <w:r>
+        <w:rPr>
+          <w:b/>
+        </w:rPr>
+        <w:t xml:space="preserve">oscillating</w:t>
+      </w:r>
+      <w:r>
+        <w:t xml:space="preserve"> </w:t>
+      </w:r>
+      <w:r>
+        <w:t xml:space="preserve">a lot..!)</w:t>
+      </w:r>
+    </w:p>
+    <w:p>
+      <w:pPr>
+        <w:pStyle w:val="Compact"/>
+        <w:numPr>
+          <w:numId w:val="1001"/>
+          <w:ilvl w:val="0"/>
+        </w:numPr>
+      </w:pPr>
+      <w:r>
+        <w:t xml:space="preserve">Position, and Velocity, control of DC motor as replacement for dynamixel servos in the base.</w:t>
+      </w:r>
+    </w:p>
+    <w:p>
+      <w:pPr>
+        <w:pStyle w:val="Compact"/>
+        <w:numPr>
+          <w:numId w:val="1001"/>
+          <w:ilvl w:val="0"/>
+        </w:numPr>
+      </w:pPr>
+      <w:r>
+        <w:t xml:space="preserve">TCP/IP commuincation between ROS and non-ROS module.</w:t>
+      </w:r>
+    </w:p>
+    <w:p>
+      <w:pPr>
+        <w:pStyle w:val="Compact"/>
+        <w:numPr>
+          <w:numId w:val="1001"/>
+          <w:ilvl w:val="0"/>
+        </w:numPr>
+      </w:pPr>
+      <w:r>
+        <w:t xml:space="preserve">To perform basic motion planning simulation in Gazebo using smach.</w:t>
+      </w:r>
+    </w:p>
+    <w:p>
+      <w:pPr>
+        <w:pStyle w:val="Compact"/>
+        <w:numPr>
+          <w:numId w:val="1001"/>
+          <w:ilvl w:val="0"/>
+        </w:numPr>
+      </w:pPr>
+      <w:r>
+        <w:rPr>
+          <w:i/>
+        </w:rPr>
+        <w:t xml:space="preserve">Sensor Integartion</w:t>
+      </w:r>
     </w:p>
     <w:p>
       <w:pPr>
@@ -156,14 +325,9 @@
           <w:ilvl w:val="1"/>
         </w:numPr>
       </w:pPr>
-      <w:hyperlink w:anchor="chicken-factories-of-india">
-        <w:r>
-          <w:rPr>
-            <w:rStyle w:val="Hyperlink"/>
-          </w:rPr>
-          <w:t xml:space="preserve">Chicken Factories of India</w:t>
-        </w:r>
-      </w:hyperlink>
+      <w:r>
+        <w:t xml:space="preserve">IMU sensor integration with ROS for Navigation</w:t>
+      </w:r>
     </w:p>
     <w:p>
       <w:pPr>
@@ -173,14 +337,9 @@
           <w:ilvl w:val="1"/>
         </w:numPr>
       </w:pPr>
-      <w:hyperlink w:anchor="failing-is-not-bad..">
-        <w:r>
-          <w:rPr>
-            <w:rStyle w:val="Hyperlink"/>
-          </w:rPr>
-          <w:t xml:space="preserve">Failing is not Bad..!</w:t>
-        </w:r>
-      </w:hyperlink>
+      <w:r>
+        <w:t xml:space="preserve">Tactile sensor for Human-Robot Interaction</w:t>
+      </w:r>
     </w:p>
     <w:p>
       <w:pPr>
@@ -190,178 +349,28 @@
           <w:ilvl w:val="1"/>
         </w:numPr>
       </w:pPr>
-      <w:hyperlink w:anchor="why-i-applied-to-the-industry">
-        <w:r>
-          <w:rPr>
-            <w:rStyle w:val="Hyperlink"/>
-          </w:rPr>
-          <w:t xml:space="preserve">Why I applied to the Industry ?</w:t>
-        </w:r>
-      </w:hyperlink>
+      <w:r>
+        <w:t xml:space="preserve">Ultrasonic sensor integration with ROS for Obstacle avoidance.</w:t>
+      </w:r>
+    </w:p>
+    <w:p>
+      <w:pPr>
+        <w:pStyle w:val="FirstParagraph"/>
+      </w:pPr>
+    </w:p>
+    <w:p>
+      <w:pPr>
+        <w:pStyle w:val="Heading4"/>
+      </w:pPr>
+      <w:bookmarkStart w:id="28" w:name="the-best-place-to-work"/>
+      <w:r>
+        <w:t xml:space="preserve">The Best Place to Work</w:t>
+      </w:r>
+      <w:bookmarkEnd w:id="28"/>
     </w:p>
     <w:p>
       <w:pPr>
         <w:pStyle w:val="Compact"/>
-        <w:numPr>
-          <w:numId w:val="1002"/>
-          <w:ilvl w:val="1"/>
-        </w:numPr>
-      </w:pPr>
-      <w:hyperlink w:anchor="the-best-place-to-work">
-        <w:r>
-          <w:rPr>
-            <w:rStyle w:val="Hyperlink"/>
-          </w:rPr>
-          <w:t xml:space="preserve">The Best Place to Work</w:t>
-        </w:r>
-      </w:hyperlink>
-    </w:p>
-    <w:p>
-      <w:pPr>
-        <w:pStyle w:val="Compact"/>
-        <w:numPr>
-          <w:numId w:val="1002"/>
-          <w:ilvl w:val="1"/>
-        </w:numPr>
-      </w:pPr>
-      <w:hyperlink w:anchor="why-robotics">
-        <w:r>
-          <w:rPr>
-            <w:rStyle w:val="Hyperlink"/>
-          </w:rPr>
-          <w:t xml:space="preserve">Why Robotics ?</w:t>
-        </w:r>
-      </w:hyperlink>
-    </w:p>
-    <w:p>
-      <w:pPr>
-        <w:pStyle w:val="Compact"/>
-        <w:numPr>
-          <w:numId w:val="1001"/>
-          <w:ilvl w:val="0"/>
-        </w:numPr>
-      </w:pPr>
-      <w:hyperlink w:anchor="projects-at-asimov-robotics">
-        <w:r>
-          <w:rPr>
-            <w:rStyle w:val="Hyperlink"/>
-          </w:rPr>
-          <w:t xml:space="preserve">Projects at Asimov Robotics</w:t>
-        </w:r>
-      </w:hyperlink>
-    </w:p>
-    <w:p>
-      <w:pPr>
-        <w:pStyle w:val="FirstParagraph"/>
-      </w:pPr>
-    </w:p>
-    <w:p>
-      <w:pPr>
-        <w:pStyle w:val="Heading3"/>
-      </w:pPr>
-      <w:bookmarkStart w:id="22" w:name="how-i-went-after-robotics"/>
-      <w:r>
-        <w:t xml:space="preserve">How I went after robotics ?</w:t>
-      </w:r>
-      <w:bookmarkEnd w:id="22"/>
-    </w:p>
-    <w:p>
-      <w:pPr>
-        <w:pStyle w:val="Heading4"/>
-      </w:pPr>
-      <w:bookmarkStart w:id="23" w:name="chicken-factories-of-india"/>
-      <w:r>
-        <w:t xml:space="preserve">Chicken Factories of India</w:t>
-      </w:r>
-      <w:bookmarkEnd w:id="23"/>
-    </w:p>
-    <w:p>
-      <w:pPr>
-        <w:pStyle w:val="Compact"/>
-      </w:pPr>
-      <w:r>
-        <w:t xml:space="preserve">I was one among million students in private engineering colleges where most of the lecturers, neither having research experience nor any industrial exposure, will teach. My time and energy was wasted by having classes for 8 hours a day. We were supposed to do experiments where no mistake are allowed (should not burn even a resistor!). We didn’t even have the freedom of choosing an elective. It wasn’t a college, but a chicken factory producing graduates with a certificate. An engineering college in India is a completely useless thing backed up by politicians to ruin youngsters’ life in the name of education.</w:t>
-      </w:r>
-    </w:p>
-    <w:p>
-      <w:pPr>
-        <w:pStyle w:val="BodyText"/>
-      </w:pPr>
-    </w:p>
-    <w:p>
-      <w:pPr>
-        <w:pStyle w:val="Heading4"/>
-      </w:pPr>
-      <w:bookmarkStart w:id="24" w:name="failing-is-not-bad.."/>
-      <w:r>
-        <w:t xml:space="preserve">Failing is not Bad..!</w:t>
-      </w:r>
-      <w:bookmarkEnd w:id="24"/>
-    </w:p>
-    <w:p>
-      <w:pPr>
-        <w:pStyle w:val="Compact"/>
-      </w:pPr>
-      <w:r>
-        <w:t xml:space="preserve">In our final year, we were supposed to do a Project. Being a guy from a farming family, I wanted to help my grandfather. Thus, I decided to do agricultural automation but I had none to guide me. So, without knowing the depth of the project, I decided to make an autonomous de-weeding robot. I started taking a few online courses related to robotics and after a while I realised that building the hardware without any guidance was not feasible. I then decided, to do some motion planning simulation on MATLAB. Though I failed to do the de-weeding robot, I learned a bit about robotics. Simultaneously, I was practising python, C, C++ and doing some basic tutorial on ROS. The field was inter-disciplinary and there was lot of stuff to learn which I was enjoying.</w:t>
-      </w:r>
-    </w:p>
-    <w:p>
-      <w:pPr>
-        <w:pStyle w:val="BodyText"/>
-      </w:pPr>
-    </w:p>
-    <w:p>
-      <w:pPr>
-        <w:pStyle w:val="Heading4"/>
-      </w:pPr>
-      <w:bookmarkStart w:id="25" w:name="why-i-applied-to-the-industry"/>
-      <w:r>
-        <w:t xml:space="preserve">Why I applied to the Industry ?</w:t>
-      </w:r>
-      <w:bookmarkEnd w:id="25"/>
-    </w:p>
-    <w:p>
-      <w:pPr>
-        <w:pStyle w:val="Compact"/>
-      </w:pPr>
-      <w:r>
-        <w:t xml:space="preserve">Apart from practising tutorials, I would sometimes think of new ideas to work on. But someone would have already done that and I would end-up not knowing what to do further. So, I decided to get hands on experience on real hardware to know what to do further. I applied for nearly 100+ companies and got reply from four. I successfully completed a task assigned by one of them, which tested my software skills &amp; basic knowledge about robotics. I was then selected for full time Internship in</w:t>
-      </w:r>
-      <w:r>
-        <w:t xml:space="preserve"> </w:t>
-      </w:r>
-      <w:r>
-        <w:rPr>
-          <w:b/>
-        </w:rPr>
-        <w:t xml:space="preserve">Software Development (R&amp;D)</w:t>
-      </w:r>
-      <w:r>
-        <w:t xml:space="preserve"> </w:t>
-      </w:r>
-      <w:r>
-        <w:t xml:space="preserve">at ASIMOV Robotics Pvt. Ltd, Kochi, India. While most of my friends got a IT, or Sales Job with higher perk, I was happy as hell to get a work which I really wanted to do..!</w:t>
-      </w:r>
-    </w:p>
-    <w:p>
-      <w:pPr>
-        <w:pStyle w:val="BodyText"/>
-      </w:pPr>
-    </w:p>
-    <w:p>
-      <w:pPr>
-        <w:pStyle w:val="Heading4"/>
-      </w:pPr>
-      <w:bookmarkStart w:id="26" w:name="the-best-place-to-work"/>
-      <w:r>
-        <w:t xml:space="preserve">The Best Place to Work</w:t>
-      </w:r>
-      <w:bookmarkEnd w:id="26"/>
-    </w:p>
-    <w:p>
-      <w:pPr>
-        <w:pStyle w:val="Compact"/>
       </w:pPr>
       <w:r>
         <w:t xml:space="preserve">It wan’t a huge company. But being in a hardware start-up taught me more than I could ever possibly imagine. I was fortunate to get my hands around hardware and was able to see how real products were being built and how they approached a real world problem. Most importantly my coding and debugging skills were tremendously improving, thanks to my mentors</w:t>
@@ -369,7 +378,7 @@
       <w:r>
         <w:t xml:space="preserve"> </w:t>
       </w:r>
-      <w:hyperlink r:id="rId27">
+      <w:hyperlink r:id="rId29">
         <w:r>
           <w:rPr>
             <w:rStyle w:val="Hyperlink"/>
@@ -386,7 +395,7 @@
       <w:r>
         <w:t xml:space="preserve"> </w:t>
       </w:r>
-      <w:hyperlink r:id="rId28">
+      <w:hyperlink r:id="rId30">
         <w:r>
           <w:rPr>
             <w:rStyle w:val="Hyperlink"/>
@@ -403,7 +412,7 @@
       <w:r>
         <w:t xml:space="preserve"> </w:t>
       </w:r>
-      <w:hyperlink r:id="rId29">
+      <w:hyperlink r:id="rId31">
         <w:r>
           <w:rPr>
             <w:rStyle w:val="Hyperlink"/>
@@ -417,7 +426,7 @@
       <w:r>
         <w:t xml:space="preserve"> </w:t>
       </w:r>
-      <w:hyperlink r:id="rId30">
+      <w:hyperlink r:id="rId32">
         <w:r>
           <w:rPr>
             <w:rStyle w:val="Hyperlink"/>
@@ -432,294 +441,6 @@
     <w:p>
       <w:pPr>
         <w:pStyle w:val="BodyText"/>
-      </w:pPr>
-    </w:p>
-    <w:p>
-      <w:pPr>
-        <w:pStyle w:val="Heading4"/>
-      </w:pPr>
-      <w:bookmarkStart w:id="31" w:name="why-robotics"/>
-      <w:r>
-        <w:t xml:space="preserve">Why Robotics ?</w:t>
-      </w:r>
-      <w:bookmarkEnd w:id="31"/>
-    </w:p>
-    <w:p>
-      <w:pPr>
-        <w:pStyle w:val="Compact"/>
-      </w:pPr>
-      <w:r>
-        <w:t xml:space="preserve">I took Mechanical Engineering because I was always interested in how things move and work, from high school. The beauty of a child playing, and day-to-day small activites we do, can only be realised when we try to make a robot like us. Though being hard it is an interesting challenge. I would say Robotics is the pinnacle of classical mechanics. It requires various skills in Math, Computer, Electrical, Mechanical, Controls, etc. Almost all the fields which are based upon on classical mechanics would be a subset of robotics. Such a diverse field with a cool hardware should arouse excitment in you as well. Thus question shouldn’t be,</w:t>
-      </w:r>
-      <w:r>
-        <w:t xml:space="preserve"> </w:t>
-      </w:r>
-      <w:r>
-        <w:t xml:space="preserve">“</w:t>
-      </w:r>
-      <w:r>
-        <w:t xml:space="preserve">Why robotics ?</w:t>
-      </w:r>
-      <w:r>
-        <w:t xml:space="preserve">”</w:t>
-      </w:r>
-      <w:r>
-        <w:t xml:space="preserve"> </w:t>
-      </w:r>
-      <w:r>
-        <w:t xml:space="preserve">but</w:t>
-      </w:r>
-      <w:r>
-        <w:t xml:space="preserve"> </w:t>
-      </w:r>
-      <w:r>
-        <w:t xml:space="preserve">“</w:t>
-      </w:r>
-      <w:r>
-        <w:t xml:space="preserve">Why not robotics ?</w:t>
-      </w:r>
-      <w:r>
-        <w:t xml:space="preserve">”</w:t>
-      </w:r>
-    </w:p>
-    <w:p>
-      <w:pPr>
-        <w:pStyle w:val="BodyText"/>
-      </w:pPr>
-      <w:r>
-        <w:t xml:space="preserve"> </w:t>
-      </w:r>
-    </w:p>
-    <w:p>
-      <w:pPr>
-        <w:pStyle w:val="Heading3"/>
-      </w:pPr>
-      <w:bookmarkStart w:id="32" w:name="projects-at-asimov-robotics"/>
-      <w:r>
-        <w:t xml:space="preserve">Projects at Asimov Robotics</w:t>
-      </w:r>
-      <w:bookmarkEnd w:id="32"/>
-    </w:p>
-    <w:p>
-      <w:pPr>
-        <w:pStyle w:val="FirstParagraph"/>
-      </w:pPr>
-      <w:r>
-        <w:t xml:space="preserve">Th task was to develop a</w:t>
-      </w:r>
-      <w:r>
-        <w:t xml:space="preserve"> </w:t>
-      </w:r>
-      <w:hyperlink r:id="rId33">
-        <w:r>
-          <w:rPr>
-            <w:rStyle w:val="Hyperlink"/>
-          </w:rPr>
-          <w:t xml:space="preserve">service robot</w:t>
-        </w:r>
-      </w:hyperlink>
-      <w:r>
-        <w:t xml:space="preserve">. The hardware was built by using</w:t>
-      </w:r>
-      <w:r>
-        <w:t xml:space="preserve"> </w:t>
-      </w:r>
-      <w:hyperlink r:id="rId34">
-        <w:r>
-          <w:rPr>
-            <w:rStyle w:val="Hyperlink"/>
-          </w:rPr>
-          <w:t xml:space="preserve">Dynamixel servos</w:t>
-        </w:r>
-      </w:hyperlink>
-      <w:r>
-        <w:t xml:space="preserve">,</w:t>
-      </w:r>
-      <w:r>
-        <w:t xml:space="preserve"> </w:t>
-      </w:r>
-      <w:hyperlink r:id="rId35">
-        <w:r>
-          <w:rPr>
-            <w:rStyle w:val="Hyperlink"/>
-          </w:rPr>
-          <w:t xml:space="preserve">Hokuyo laser</w:t>
-        </w:r>
-      </w:hyperlink>
-      <w:r>
-        <w:t xml:space="preserve"> </w:t>
-      </w:r>
-      <w:r>
-        <w:t xml:space="preserve">and</w:t>
-      </w:r>
-      <w:r>
-        <w:t xml:space="preserve"> </w:t>
-      </w:r>
-      <w:hyperlink r:id="rId36">
-        <w:r>
-          <w:rPr>
-            <w:rStyle w:val="Hyperlink"/>
-          </w:rPr>
-          <w:t xml:space="preserve">Intel-NUC</w:t>
-        </w:r>
-      </w:hyperlink>
-      <w:r>
-        <w:t xml:space="preserve">. The software was architectured using ROS</w:t>
-      </w:r>
-      <w:r>
-        <w:t xml:space="preserve"> </w:t>
-      </w:r>
-      <w:hyperlink r:id="rId37">
-        <w:r>
-          <w:rPr>
-            <w:rStyle w:val="Hyperlink"/>
-          </w:rPr>
-          <w:t xml:space="preserve">smach</w:t>
-        </w:r>
-      </w:hyperlink>
-      <w:r>
-        <w:t xml:space="preserve">. Users can interact with robot by the screen at the front and based upon the user query, the robot would do a particular task. The task consist of doing some gesture and navigation. Gestures were perfomed by simple record and playback, while navigation was done using</w:t>
-      </w:r>
-      <w:r>
-        <w:t xml:space="preserve"> </w:t>
-      </w:r>
-      <w:hyperlink r:id="rId38">
-        <w:r>
-          <w:rPr>
-            <w:rStyle w:val="Hyperlink"/>
-          </w:rPr>
-          <w:t xml:space="preserve">amcl</w:t>
-        </w:r>
-      </w:hyperlink>
-      <w:r>
-        <w:t xml:space="preserve"> </w:t>
-      </w:r>
-      <w:r>
-        <w:t xml:space="preserve">package. During my six month stay, the various task I did:</w:t>
-      </w:r>
-    </w:p>
-    <w:p>
-      <w:pPr>
-        <w:pStyle w:val="BodyText"/>
-      </w:pPr>
-    </w:p>
-    <w:p>
-      <w:pPr>
-        <w:pStyle w:val="Compact"/>
-        <w:numPr>
-          <w:numId w:val="1003"/>
-          <w:ilvl w:val="0"/>
-        </w:numPr>
-      </w:pPr>
-      <w:r>
-        <w:t xml:space="preserve">Gravity compensation of cool-arm for assistive mode. (didn’t work well, was</w:t>
-      </w:r>
-      <w:r>
-        <w:t xml:space="preserve"> </w:t>
-      </w:r>
-      <w:r>
-        <w:rPr>
-          <w:b/>
-        </w:rPr>
-        <w:t xml:space="preserve">oscillating</w:t>
-      </w:r>
-      <w:r>
-        <w:t xml:space="preserve"> </w:t>
-      </w:r>
-      <w:r>
-        <w:t xml:space="preserve">a lot..!)</w:t>
-      </w:r>
-    </w:p>
-    <w:p>
-      <w:pPr>
-        <w:pStyle w:val="Compact"/>
-        <w:numPr>
-          <w:numId w:val="1003"/>
-          <w:ilvl w:val="0"/>
-        </w:numPr>
-      </w:pPr>
-      <w:r>
-        <w:t xml:space="preserve">Position, and Velocity, control of DC motor as replacement for dynamixel servos in the base.</w:t>
-      </w:r>
-    </w:p>
-    <w:p>
-      <w:pPr>
-        <w:pStyle w:val="Compact"/>
-        <w:numPr>
-          <w:numId w:val="1003"/>
-          <w:ilvl w:val="0"/>
-        </w:numPr>
-      </w:pPr>
-      <w:r>
-        <w:t xml:space="preserve">TCP/IP commuincation between ROS and non-ROS module.</w:t>
-      </w:r>
-    </w:p>
-    <w:p>
-      <w:pPr>
-        <w:pStyle w:val="Compact"/>
-        <w:numPr>
-          <w:numId w:val="1003"/>
-          <w:ilvl w:val="0"/>
-        </w:numPr>
-      </w:pPr>
-      <w:r>
-        <w:t xml:space="preserve">To perform basic motion planning simulation in Gazebo using smach.</w:t>
-      </w:r>
-    </w:p>
-    <w:p>
-      <w:pPr>
-        <w:pStyle w:val="Compact"/>
-        <w:numPr>
-          <w:numId w:val="1003"/>
-          <w:ilvl w:val="0"/>
-        </w:numPr>
-      </w:pPr>
-      <w:r>
-        <w:rPr>
-          <w:i/>
-        </w:rPr>
-        <w:t xml:space="preserve">Sensor Integartion</w:t>
-      </w:r>
-    </w:p>
-    <w:p>
-      <w:pPr>
-        <w:pStyle w:val="Compact"/>
-        <w:numPr>
-          <w:numId w:val="1004"/>
-          <w:ilvl w:val="1"/>
-        </w:numPr>
-      </w:pPr>
-      <w:r>
-        <w:t xml:space="preserve">IMU sensor integration with ROS for Navigation</w:t>
-      </w:r>
-    </w:p>
-    <w:p>
-      <w:pPr>
-        <w:pStyle w:val="Compact"/>
-        <w:numPr>
-          <w:numId w:val="1004"/>
-          <w:ilvl w:val="1"/>
-        </w:numPr>
-      </w:pPr>
-      <w:r>
-        <w:t xml:space="preserve">Tactile sensor for Human-Robot Interaction</w:t>
-      </w:r>
-    </w:p>
-    <w:p>
-      <w:pPr>
-        <w:pStyle w:val="Compact"/>
-        <w:numPr>
-          <w:numId w:val="1004"/>
-          <w:ilvl w:val="1"/>
-        </w:numPr>
-      </w:pPr>
-      <w:r>
-        <w:t xml:space="preserve">Ultrasonic sensor integration with ROS for Obstacle avoidance.</w:t>
-      </w:r>
-    </w:p>
-    <w:p>
-      <w:pPr>
-        <w:pStyle w:val="FirstParagraph"/>
       </w:pPr>
       <w:r>
         <w:t xml:space="preserve"> </w:t>
@@ -1085,12 +806,6 @@
     <w:abstractNumId w:val="991"/>
   </w:num>
   <w:num w:numId="1002">
-    <w:abstractNumId w:val="991"/>
-  </w:num>
-  <w:num w:numId="1003">
-    <w:abstractNumId w:val="991"/>
-  </w:num>
-  <w:num w:numId="1004">
     <w:abstractNumId w:val="991"/>
   </w:num>
 </w:numbering>

</xml_diff>

<commit_message>
new cv + typo check for all projects
</commit_message>
<xml_diff>
--- a/_includes/projects/past/asimov/output/asimov.docx
+++ b/_includes/projects/past/asimov/output/asimov.docx
@@ -123,11 +123,6 @@
     </w:p>
     <w:p>
       <w:pPr>
-        <w:pStyle w:val="BodyText"/>
-      </w:pPr>
-    </w:p>
-    <w:p>
-      <w:pPr>
         <w:pStyle w:val="Heading4"/>
       </w:pPr>
       <w:bookmarkStart w:id="21" w:name="projects-at-asimov-robotics"/>
@@ -141,7 +136,7 @@
         <w:pStyle w:val="FirstParagraph"/>
       </w:pPr>
       <w:r>
-        <w:t xml:space="preserve">Th task was to develop a</w:t>
+        <w:t xml:space="preserve">The task was to develop a</w:t>
       </w:r>
       <w:r>
         <w:t xml:space="preserve"> </w:t>
@@ -183,10 +178,7 @@
         </w:r>
       </w:hyperlink>
       <w:r>
-        <w:t xml:space="preserve"> </w:t>
-      </w:r>
-      <w:r>
-        <w:t xml:space="preserve">and</w:t>
+        <w:t xml:space="preserve">, and</w:t>
       </w:r>
       <w:r>
         <w:t xml:space="preserve"> </w:t>
@@ -214,7 +206,7 @@
         </w:r>
       </w:hyperlink>
       <w:r>
-        <w:t xml:space="preserve">. Users can interact with robot through the screen at the front and based upon the user query, the robot would do a particular task. The task consists of some gestures and navigation. Gestures were perfomed by simple record and playback, while navigation was done using</w:t>
+        <w:t xml:space="preserve">. Users can interact with the robot through the screen at the front and based upon the user query, the robot would do a particular task. The task consists of some gestures and navigation. Gestures were performed by simple record and playback, while navigation was done using</w:t>
       </w:r>
       <w:r>
         <w:t xml:space="preserve"> </w:t>
@@ -275,7 +267,7 @@
         </w:numPr>
       </w:pPr>
       <w:r>
-        <w:t xml:space="preserve">Position and Velocity control of DC motor as replacement for dynamixel servos in the base.</w:t>
+        <w:t xml:space="preserve">Position and Velocity control of DC motor as a replacement for dynamixel servos in the base.</w:t>
       </w:r>
     </w:p>
     <w:p>
@@ -287,7 +279,7 @@
         </w:numPr>
       </w:pPr>
       <w:r>
-        <w:t xml:space="preserve">TCP/IP commuincation between ROS and non-ROS module.</w:t>
+        <w:t xml:space="preserve">TCP/IP communication between ROS and non-ROS module.</w:t>
       </w:r>
     </w:p>
     <w:p>
@@ -311,7 +303,7 @@
         </w:numPr>
       </w:pPr>
       <w:r>
-        <w:t xml:space="preserve">Sensor Integartion</w:t>
+        <w:t xml:space="preserve">Sensor Integration</w:t>
       </w:r>
     </w:p>
     <w:p>
@@ -326,7 +318,7 @@
         <w:rPr>
           <w:i/>
         </w:rPr>
-        <w:t xml:space="preserve">IMU sensor integration with ROS for Navigation.</w:t>
+        <w:t xml:space="preserve">IMU sensor with ROS for Navigation.</w:t>
       </w:r>
     </w:p>
     <w:p>
@@ -356,7 +348,7 @@
         <w:rPr>
           <w:i/>
         </w:rPr>
-        <w:t xml:space="preserve">Ultrasonic sensor integration with ROS for Obstacle avoidance.</w:t>
+        <w:t xml:space="preserve">Ultrasonic sensor with ROS for Obstacle avoidance.</w:t>
       </w:r>
     </w:p>
     <w:p>
@@ -379,7 +371,7 @@
         <w:pStyle w:val="Compact"/>
       </w:pPr>
       <w:r>
-        <w:t xml:space="preserve">It wasn’t a huge company. But being in a hardware start-up taught me more than I could ever possibly imagine. I was fortunate to get my hands around hardware and was able to see how real products were being built and how they approached a real world problem. Most importantly my coding and debugging skills were tremendously improving, thanks to my mentors</w:t>
+        <w:t xml:space="preserve">It wasn’t a huge company. But being in a hardware start-up taught me more than I could ever possibly imagine. I was fortunate to get my hands around hardware and was able to see how real products were being built and how they approached a real-world problem. Most importantly my coding and debugging skills were tremendously improving, thanks to my mentors</w:t>
       </w:r>
       <w:r>
         <w:t xml:space="preserve"> </w:t>

</xml_diff>

<commit_message>
saya hardware pic added
</commit_message>
<xml_diff>
--- a/_includes/projects/past/asimov/output/asimov.docx
+++ b/_includes/projects/past/asimov/output/asimov.docx
@@ -68,14 +68,14 @@
     </w:p>
     <w:p>
       <w:pPr>
-        <w:pStyle w:val="CaptionedFigure"/>
+        <w:pStyle w:val="BodyText"/>
       </w:pPr>
       <w:r>
         <w:drawing>
           <wp:inline>
             <wp:extent cx="3099334" cy="6083166"/>
             <wp:effectExtent b="0" l="0" r="0" t="0"/>
-            <wp:docPr descr="Service robot developed at Asimov Robotics" title="" id="1" name="Picture"/>
+            <wp:docPr descr="CAD ModeL" title="" id="1" name="Picture"/>
             <a:graphic>
               <a:graphicData uri="http://schemas.openxmlformats.org/drawingml/2006/picture">
                 <pic:pic>
@@ -112,13 +112,11 @@
           </wp:inline>
         </w:drawing>
       </w:r>
-    </w:p>
-    <w:p>
-      <w:pPr>
-        <w:pStyle w:val="ImageCaption"/>
-      </w:pPr>
-      <w:r>
-        <w:t xml:space="preserve">Service robot developed at Asimov Robotics</w:t>
+      <w:r>
+        <w:t xml:space="preserve"> </w:t>
+      </w:r>
+      <w:r>
+        <w:t xml:space="preserve">|</w:t>
       </w:r>
     </w:p>
     <w:p>

</xml_diff>

<commit_message>
corrected asimov robotics, bldc fine-tune
</commit_message>
<xml_diff>
--- a/_includes/projects/past/asimov/output/asimov.docx
+++ b/_includes/projects/past/asimov/output/asimov.docx
@@ -331,7 +331,7 @@
         </w:numPr>
       </w:pPr>
       <w:r>
-        <w:t xml:space="preserve">To perform basic motion planning simulation in Gazebo using smach.</w:t>
+        <w:t xml:space="preserve">To perform basic motion planning simulation in Gazebo using ROS and MoveIt.</w:t>
       </w:r>
     </w:p>
     <w:p>
@@ -373,7 +373,7 @@
         <w:rPr>
           <w:i/>
         </w:rPr>
-        <w:t xml:space="preserve">Tactile sensor for Human-Robot Interaction.</w:t>
+        <w:t xml:space="preserve">Tactile sensor(FSR) for Human-Robot Interaction.</w:t>
       </w:r>
     </w:p>
     <w:p>

</xml_diff>